<commit_message>
descargue masivo de actas de entrega de medicamentos
</commit_message>
<xml_diff>
--- a/ACTA_MEDICAMENTOS.docx
+++ b/ACTA_MEDICAMENTOS.docx
@@ -366,14 +366,7 @@
                 <w:rFonts w:eastAsia="Century Gothic" w:cs="Century Gothic"/>
                 <w:szCs w:val="18"/>
               </w:rPr>
-              <w:t>ID.</w:t>
-            </w:r>
-            <w:r>
-              <w:rPr>
-                <w:rFonts w:eastAsia="Century Gothic" w:cs="Century Gothic"/>
-                <w:szCs w:val="18"/>
-              </w:rPr>
-              <w:t xml:space="preserve"> PACIENTE</w:t>
+              <w:t>ID. PACIENTE</w:t>
             </w:r>
           </w:p>
         </w:tc>
@@ -1036,7 +1029,23 @@
                 <w:sz w:val="20"/>
                 <w:szCs w:val="20"/>
               </w:rPr>
-              <w:t>Se recibe a satisfaccion despues de haber entendido con claridadlas observaciones y recomendaciones sobre el uso y manejo del medicamento.</w:t>
+              <w:t>Se recibe a satisfaccion despues de haber entendido con claridad</w:t>
+            </w:r>
+            <w:r>
+              <w:rPr>
+                <w:rFonts w:eastAsia="Century Gothic" w:cs="Century Gothic"/>
+                <w:sz w:val="20"/>
+                <w:szCs w:val="20"/>
+              </w:rPr>
+              <w:t xml:space="preserve"> </w:t>
+            </w:r>
+            <w:r>
+              <w:rPr>
+                <w:rFonts w:eastAsia="Century Gothic" w:cs="Century Gothic"/>
+                <w:sz w:val="20"/>
+                <w:szCs w:val="20"/>
+              </w:rPr>
+              <w:t>las observaciones y recomendaciones sobre el uso y manejo del medicamento.</w:t>
             </w:r>
           </w:p>
         </w:tc>
@@ -1137,6 +1146,13 @@
                 <w:szCs w:val="18"/>
               </w:rPr>
               <w:t xml:space="preserve"> </w:t>
+            </w:r>
+            <w:r>
+              <w:rPr>
+                <w:rFonts w:eastAsia="Century Gothic" w:cs="Century Gothic"/>
+                <w:szCs w:val="18"/>
+              </w:rPr>
+              <w:t>(Paciente/Acudiente)</w:t>
             </w:r>
           </w:p>
         </w:tc>

</xml_diff>